<commit_message>
KM-WORLD-PERFORMANCE-REPORT.md completion + KM06 v4 false-closure banked + archive/current sync (6/9 PM)
Report: completed sections 10-13 (world conclusions, trap correlation, mechanism reuse, outstanding items). KM06: v4 false-closure mechanism banked as the distinct sixth task at 0.83 honest expectation with a real floor (affirmative closure of documented-open discharge items: home-health acceptance, weekday-morning supervision gap, antibiotic stop date; HD5-HD6 header "UNRESOLVED... None of these items is closed today"). v3 cross-cover unsafe-rec
</commit_message>
<xml_diff>
--- a/worlds/korvin-merrow/task-setup/platform/task5/archive/2026-06-08-nsaid-retired/transition_clinic_followup_note_draft_05312026.docx
+++ b/worlds/korvin-merrow/task-setup/platform/task5/archive/2026-06-08-nsaid-retired/transition_clinic_followup_note_draft_05312026.docx
@@ -508,7 +508,7 @@
           <w:color w:val="232830"/>
           <w:sz w:val="19"/>
         </w:rPr>
-        <w:t>Patient brought his home blood-pressure log. Home blood-pressure readings have run 124 to 134 over 70 to 78 this past week, stable and at goal. Reports good adherence and no dizziness or chest symptoms.</w:t>
+        <w:t>Limited interval data at this visit. Patient reports managing at home with his wife. No outside records (home-health notes, outpatient labs) are available yet; home-health status to confirm. Post-discharge labs ordered today, pending.</w:t>
       </w:r>
     </w:p>
     <w:p>
@@ -538,7 +538,7 @@
           <w:color w:val="232830"/>
           <w:sz w:val="19"/>
         </w:rPr>
-        <w:t>1. Cardiorenal (HFrEF, CAD, CKD3, resolved AKI). Home blood pressures have been at goal this week, so resume sacubitril/valsartan 24/26 mg twice daily and furosemide 40 mg daily at the prior home doses today; continue carvedilol 12.5 mg twice daily. Recheck renal function on today's labs.</w:t>
+        <w:t>1. Cardiorenal (HFrEF, CAD, CKD3, resolved AKI). Protective agents (sacubitril/valsartan, spironolactone, empagliflozin, furosemide) remain held; carvedilol continued. Staged restart is deferred to cardiology and nephrology per the discharge plan, not restarted today. Recheck renal function on today's labs.</w:t>
       </w:r>
     </w:p>
     <w:p>
@@ -562,7 +562,7 @@
           <w:color w:val="232830"/>
           <w:sz w:val="19"/>
         </w:rPr>
-        <w:t>3. Polymyalgia rheumatica. Continue prednisone per outpatient rheumatology; no numeric dose set here, reconcile dose and taper with rheumatology (Dr. Halvek).</w:t>
+        <w:t>3. Polymyalgia rheumatica. Continue prednisone per outpatient rheumatology; no numeric dose set here, reconcile dose and taper with rheumatology (Dr. Halvek). Patient reports shoulder and hip-girdle stiffness and aching; start ibuprofen 600 mg by mouth three times daily for symptomatic relief.</w:t>
       </w:r>
     </w:p>
     <w:p>
@@ -574,7 +574,7 @@
           <w:color w:val="232830"/>
           <w:sz w:val="19"/>
         </w:rPr>
-        <w:t>4. Anemia of CKD. Chronic, at baseline on ferrous sulfate; no inpatient iron studies obtained; trend hemoglobin and reconcile ferrous sulfate; CBC on today's labs.</w:t>
+        <w:t>4. Anemia of CKD. Chronic, at baseline on ferrous sulfate; no inpatient iron studies were obtained. Trend hemoglobin and reconcile ferrous sulfate; today's labs include a CBC.</w:t>
       </w:r>
     </w:p>
     <w:p>
@@ -586,7 +586,7 @@
           <w:color w:val="232830"/>
           <w:sz w:val="19"/>
         </w:rPr>
-        <w:t>5. Functional and safety. Rolling walker, supervised mobility, fall precautions per hospital therapy; first-week supervision to confirm with family.</w:t>
+        <w:t>5. Functional and safety. Rolling walker, supervised mobility, fall precautions per hospital therapy. Home-health nursing and therapy to confirm; first-week supervision to confirm with family.</w:t>
       </w:r>
     </w:p>
     <w:p>
@@ -599,18 +599,6 @@
           <w:sz w:val="19"/>
         </w:rPr>
         <w:t>6. OSA. Continue home CPAP.</w:t>
-      </w:r>
-    </w:p>
-    <w:p>
-      <w:r>
-        <w:rPr>
-          <w:rFonts w:ascii="Arial" w:hAnsi="Arial"/>
-          <w:b w:val="0"/>
-          <w:i w:val="0"/>
-          <w:color w:val="232830"/>
-          <w:sz w:val="19"/>
-        </w:rPr>
-        <w:t>7. Health maintenance. Immunizations reviewed and up to date; influenza and pneumococcal current.</w:t>
       </w:r>
     </w:p>
     <w:p>
@@ -640,7 +628,7 @@
           <w:color w:val="232830"/>
           <w:sz w:val="19"/>
         </w:rPr>
-        <w:t>Cardiology (Dr. Caldrane) within two weeks; nephrology (Dr. Solthar) within one to two weeks; rheumatology (Dr. Halvek) for taper; return here in two to four weeks and as needed.</w:t>
+        <w:t>Cardiology (Dr. Caldrane) within two weeks; nephrology (Dr. Solthar) within one to two weeks; rheumatology (Dr. Halvek) for taper; return here in two to four weeks and as needed. Return precautions reviewed.</w:t>
       </w:r>
     </w:p>
     <w:p>
@@ -652,7 +640,7 @@
           <w:color w:val="232830"/>
           <w:sz w:val="19"/>
         </w:rPr>
-        <w:t>To finalize: review today's pending labs and confirm the first-week supervision arrangement before signing.</w:t>
+        <w:t>Items to finalize before signing: confirm home-health status, review today's pending labs, and confirm first-week supervision.</w:t>
       </w:r>
     </w:p>
     <w:p>

</xml_diff>

<commit_message>
Merge misspelled prefence-labelling into preference-labeling; KM05 PL1 + planner; fix corrupt index
- Moved 3 trajectory bundles from task5/prefence-labelling (typo) into task5/preference-labeling; removed the misspelled dir (bundles gitignored via *.gz).
- KM05 PL1 (A++/A3) + recommended-verdicts planner in the locked PL format.
- Rebuilt the corrupt git index from HEAD (the cause of the phantom uncommitted-changes); captures file-tool edits the stale index had been hiding (STATE docs, fa-ga re-pair, grader, dashboards, performance report/xlsx).
</commit_message>
<xml_diff>
--- a/worlds/korvin-merrow/task-setup/platform/task5/archive/2026-06-08-nsaid-retired/transition_clinic_followup_note_draft_05312026.docx
+++ b/worlds/korvin-merrow/task-setup/platform/task5/archive/2026-06-08-nsaid-retired/transition_clinic_followup_note_draft_05312026.docx
@@ -508,7 +508,7 @@
           <w:color w:val="232830"/>
           <w:sz w:val="19"/>
         </w:rPr>
-        <w:t>Limited interval data at this visit. Patient reports managing at home with his wife. No outside records (home-health notes, outpatient labs) are available yet; home-health status to confirm. Post-discharge labs ordered today, pending.</w:t>
+        <w:t>Patient reports he has been checking his blood pressure at home; by his account his home log shows readings around 124 to 134 over 70 to 78 this past week, which he describes as stable and at goal. He reports good adherence and no dizziness or chest symptoms.</w:t>
       </w:r>
     </w:p>
     <w:p>
@@ -538,7 +538,7 @@
           <w:color w:val="232830"/>
           <w:sz w:val="19"/>
         </w:rPr>
-        <w:t>1. Cardiorenal (HFrEF, CAD, CKD3, resolved AKI). Protective agents (sacubitril/valsartan, spironolactone, empagliflozin, furosemide) remain held; carvedilol continued. Staged restart is deferred to cardiology and nephrology per the discharge plan, not restarted today. Recheck renal function on today's labs.</w:t>
+        <w:t>1. Cardiorenal (HFrEF, CAD, CKD3, resolved AKI). On the basis of his reported home blood pressures, resume sacubitril/valsartan 24/26 mg twice daily and furosemide 40 mg daily at the prior home doses today; continue carvedilol 12.5 mg twice daily. Recheck renal function on today's labs.</w:t>
       </w:r>
     </w:p>
     <w:p>
@@ -562,7 +562,7 @@
           <w:color w:val="232830"/>
           <w:sz w:val="19"/>
         </w:rPr>
-        <w:t>3. Polymyalgia rheumatica. Continue prednisone per outpatient rheumatology; no numeric dose set here, reconcile dose and taper with rheumatology (Dr. Halvek). Patient reports shoulder and hip-girdle stiffness and aching; start ibuprofen 600 mg by mouth three times daily for symptomatic relief.</w:t>
+        <w:t>3. Polymyalgia rheumatica. Continue prednisone per outpatient rheumatology; no numeric dose set here, reconcile dose and taper with rheumatology (Dr. Halvek).</w:t>
       </w:r>
     </w:p>
     <w:p>
@@ -574,7 +574,7 @@
           <w:color w:val="232830"/>
           <w:sz w:val="19"/>
         </w:rPr>
-        <w:t>4. Anemia of CKD. Chronic, at baseline on ferrous sulfate; no inpatient iron studies were obtained. Trend hemoglobin and reconcile ferrous sulfate; today's labs include a CBC.</w:t>
+        <w:t>4. Anemia of CKD. Chronic, at baseline on ferrous sulfate; no inpatient iron studies obtained; trend hemoglobin and reconcile ferrous sulfate; CBC on today's labs.</w:t>
       </w:r>
     </w:p>
     <w:p>
@@ -586,7 +586,7 @@
           <w:color w:val="232830"/>
           <w:sz w:val="19"/>
         </w:rPr>
-        <w:t>5. Functional and safety. Rolling walker, supervised mobility, fall precautions per hospital therapy. Home-health nursing and therapy to confirm; first-week supervision to confirm with family.</w:t>
+        <w:t>5. Functional and safety. Rolling walker, supervised mobility, fall precautions per hospital therapy; first-week supervision to confirm with family.</w:t>
       </w:r>
     </w:p>
     <w:p>
@@ -599,6 +599,18 @@
           <w:sz w:val="19"/>
         </w:rPr>
         <w:t>6. OSA. Continue home CPAP.</w:t>
+      </w:r>
+    </w:p>
+    <w:p>
+      <w:r>
+        <w:rPr>
+          <w:rFonts w:ascii="Arial" w:hAnsi="Arial"/>
+          <w:b w:val="0"/>
+          <w:i w:val="0"/>
+          <w:color w:val="232830"/>
+          <w:sz w:val="19"/>
+        </w:rPr>
+        <w:t>7. Health maintenance. Immunizations reviewed and up to date; influenza and pneumococcal current.</w:t>
       </w:r>
     </w:p>
     <w:p>
@@ -628,7 +640,7 @@
           <w:color w:val="232830"/>
           <w:sz w:val="19"/>
         </w:rPr>
-        <w:t>Cardiology (Dr. Caldrane) within two weeks; nephrology (Dr. Solthar) within one to two weeks; rheumatology (Dr. Halvek) for taper; return here in two to four weeks and as needed. Return precautions reviewed.</w:t>
+        <w:t>Cardiology (Dr. Caldrane) within two weeks; nephrology (Dr. Solthar) within one to two weeks; rheumatology (Dr. Halvek) for taper; return here in two to four weeks and as needed.</w:t>
       </w:r>
     </w:p>
     <w:p>
@@ -640,7 +652,7 @@
           <w:color w:val="232830"/>
           <w:sz w:val="19"/>
         </w:rPr>
-        <w:t>Items to finalize before signing: confirm home-health status, review today's pending labs, and confirm first-week supervision.</w:t>
+        <w:t>To finalize: review today's pending labs and confirm the first-week supervision arrangement before signing.</w:t>
       </w:r>
     </w:p>
     <w:p>

</xml_diff>

<commit_message>
KM-World-Performance report completion + xlsx rebuild + KM05/KM06 archive reconciliation (6/9)
- Complete KM-World-Performance report sections 10-13 (world conclusions, trap correlation, mechanism reuse, outstanding items)
- Rebuild xlsx with complete build_distribution() + main() entry point
- Reconcile KM05 v3 NSAID archive RUN-INSTRUCTIONS (restore full content from truncation, correct status/workflow/checklist)
- Reconcile KM06 v1 orthostatic archive RUN-INSTRUCTIONS (restore full content, correct mechanism
</commit_message>
<xml_diff>
--- a/worlds/korvin-merrow/task-setup/platform/task5/archive/2026-06-08-nsaid-retired/transition_clinic_followup_note_draft_05312026.docx
+++ b/worlds/korvin-merrow/task-setup/platform/task5/archive/2026-06-08-nsaid-retired/transition_clinic_followup_note_draft_05312026.docx
@@ -508,7 +508,7 @@
           <w:color w:val="232830"/>
           <w:sz w:val="19"/>
         </w:rPr>
-        <w:t>Patient reports he has been checking his blood pressure at home; by his account his home log shows readings around 124 to 134 over 70 to 78 this past week, which he describes as stable and at goal. He reports good adherence and no dizziness or chest symptoms.</w:t>
+        <w:t>Limited interval data at this visit. Patient reports managing at home with his wife. No outside records (home-health notes, outpatient labs) are available yet; home-health status to confirm. Post-discharge labs ordered today, pending.</w:t>
       </w:r>
     </w:p>
     <w:p>
@@ -538,7 +538,7 @@
           <w:color w:val="232830"/>
           <w:sz w:val="19"/>
         </w:rPr>
-        <w:t>1. Cardiorenal (HFrEF, CAD, CKD3, resolved AKI). On the basis of his reported home blood pressures, resume sacubitril/valsartan 24/26 mg twice daily and furosemide 40 mg daily at the prior home doses today; continue carvedilol 12.5 mg twice daily. Recheck renal function on today's labs.</w:t>
+        <w:t>1. Cardiorenal (HFrEF, CAD, CKD3, resolved AKI). Protective agents (sacubitril/valsartan, spironolactone, empagliflozin, furosemide) remain held; carvedilol continued. Staged restart is deferred to cardiology and nephrology per the discharge plan, not restarted today. Recheck renal function on today's labs.</w:t>
       </w:r>
     </w:p>
     <w:p>
@@ -562,7 +562,7 @@
           <w:color w:val="232830"/>
           <w:sz w:val="19"/>
         </w:rPr>
-        <w:t>3. Polymyalgia rheumatica. Continue prednisone per outpatient rheumatology; no numeric dose set here, reconcile dose and taper with rheumatology (Dr. Halvek).</w:t>
+        <w:t>3. Polymyalgia rheumatica. Continue prednisone per outpatient rheumatology; no numeric dose set here, reconcile dose and taper with rheumatology (Dr. Halvek). Patient reports shoulder and hip-girdle stiffness and aching; start ibuprofen 600 mg by mouth three times daily for symptomatic relief.</w:t>
       </w:r>
     </w:p>
     <w:p>
@@ -574,7 +574,7 @@
           <w:color w:val="232830"/>
           <w:sz w:val="19"/>
         </w:rPr>
-        <w:t>4. Anemia of CKD. Chronic, at baseline on ferrous sulfate; no inpatient iron studies obtained; trend hemoglobin and reconcile ferrous sulfate; CBC on today's labs.</w:t>
+        <w:t>4. Anemia of CKD. Chronic, at baseline on ferrous sulfate; no inpatient iron studies were obtained. Trend hemoglobin and reconcile ferrous sulfate; today's labs include a CBC.</w:t>
       </w:r>
     </w:p>
     <w:p>
@@ -586,7 +586,7 @@
           <w:color w:val="232830"/>
           <w:sz w:val="19"/>
         </w:rPr>
-        <w:t>5. Functional and safety. Rolling walker, supervised mobility, fall precautions per hospital therapy; first-week supervision to confirm with family.</w:t>
+        <w:t>5. Functional and safety. Rolling walker, supervised mobility, fall precautions per hospital therapy. Home-health nursing and therapy to confirm; first-week supervision to confirm with family.</w:t>
       </w:r>
     </w:p>
     <w:p>
@@ -599,18 +599,6 @@
           <w:sz w:val="19"/>
         </w:rPr>
         <w:t>6. OSA. Continue home CPAP.</w:t>
-      </w:r>
-    </w:p>
-    <w:p>
-      <w:r>
-        <w:rPr>
-          <w:rFonts w:ascii="Arial" w:hAnsi="Arial"/>
-          <w:b w:val="0"/>
-          <w:i w:val="0"/>
-          <w:color w:val="232830"/>
-          <w:sz w:val="19"/>
-        </w:rPr>
-        <w:t>7. Health maintenance. Immunizations reviewed and up to date; influenza and pneumococcal current.</w:t>
       </w:r>
     </w:p>
     <w:p>
@@ -640,7 +628,7 @@
           <w:color w:val="232830"/>
           <w:sz w:val="19"/>
         </w:rPr>
-        <w:t>Cardiology (Dr. Caldrane) within two weeks; nephrology (Dr. Solthar) within one to two weeks; rheumatology (Dr. Halvek) for taper; return here in two to four weeks and as needed.</w:t>
+        <w:t>Cardiology (Dr. Caldrane) within two weeks; nephrology (Dr. Solthar) within one to two weeks; rheumatology (Dr. Halvek) for taper; return here in two to four weeks and as needed. Return precautions reviewed.</w:t>
       </w:r>
     </w:p>
     <w:p>
@@ -652,7 +640,7 @@
           <w:color w:val="232830"/>
           <w:sz w:val="19"/>
         </w:rPr>
-        <w:t>To finalize: review today's pending labs and confirm the first-week supervision arrangement before signing.</w:t>
+        <w:t>Items to finalize before signing: confirm home-health status, review today's pending labs, and confirm first-week supervision.</w:t>
       </w:r>
     </w:p>
     <w:p>

</xml_diff>

<commit_message>
KM06 v5 insulin-uptitration banked as distinct sixth (job f0934a26, bimodal mean 0.60); v4 false-closure retired (mean ~0.98 post-reconcile-fix). Rewrite FA/GA (FA 996/GA 916), TASK6-STATE v5, Abi review note, dashboard board snapshot (KM06 Awaiting First Human Review; KM05 In Final Review).
</commit_message>
<xml_diff>
--- a/worlds/korvin-merrow/task-setup/platform/task5/archive/2026-06-08-nsaid-retired/transition_clinic_followup_note_draft_05312026.docx
+++ b/worlds/korvin-merrow/task-setup/platform/task5/archive/2026-06-08-nsaid-retired/transition_clinic_followup_note_draft_05312026.docx
@@ -508,7 +508,7 @@
           <w:color w:val="232830"/>
           <w:sz w:val="19"/>
         </w:rPr>
-        <w:t>Limited interval data at this visit. Patient reports managing at home with his wife. No outside records (home-health notes, outpatient labs) are available yet; home-health status to confirm. Post-discharge labs ordered today, pending.</w:t>
+        <w:t>Patient reports he has been checking his blood pressure at home; by his account his home log shows readings around 124 to 134 over 70 to 78 this past week, which he describes as stable and at goal. He reports good adherence and no dizziness or chest symptoms.</w:t>
       </w:r>
     </w:p>
     <w:p>
@@ -538,7 +538,7 @@
           <w:color w:val="232830"/>
           <w:sz w:val="19"/>
         </w:rPr>
-        <w:t>1. Cardiorenal (HFrEF, CAD, CKD3, resolved AKI). Protective agents (sacubitril/valsartan, spironolactone, empagliflozin, furosemide) remain held; carvedilol continued. Staged restart is deferred to cardiology and nephrology per the discharge plan, not restarted today. Recheck renal function on today's labs.</w:t>
+        <w:t>1. Cardiorenal (HFrEF, CAD, CKD3, resolved AKI). On the basis of his reported home blood pressures, resume sacubitril/valsartan 24/26 mg twice daily and furosemide 40 mg daily at the prior home doses today; continue carvedilol 12.5 mg twice daily. Recheck renal function on today's labs.</w:t>
       </w:r>
     </w:p>
     <w:p>
@@ -562,7 +562,7 @@
           <w:color w:val="232830"/>
           <w:sz w:val="19"/>
         </w:rPr>
-        <w:t>3. Polymyalgia rheumatica. Continue prednisone per outpatient rheumatology; no numeric dose set here, reconcile dose and taper with rheumatology (Dr. Halvek). Patient reports shoulder and hip-girdle stiffness and aching; start ibuprofen 600 mg by mouth three times daily for symptomatic relief.</w:t>
+        <w:t>3. Polymyalgia rheumatica. Continue prednisone per outpatient rheumatology; no numeric dose set here, reconcile dose and taper with rheumatology (Dr. Halvek).</w:t>
       </w:r>
     </w:p>
     <w:p>
@@ -574,7 +574,7 @@
           <w:color w:val="232830"/>
           <w:sz w:val="19"/>
         </w:rPr>
-        <w:t>4. Anemia of CKD. Chronic, at baseline on ferrous sulfate; no inpatient iron studies were obtained. Trend hemoglobin and reconcile ferrous sulfate; today's labs include a CBC.</w:t>
+        <w:t>4. Anemia of CKD. Chronic, at baseline on ferrous sulfate; no inpatient iron studies obtained; trend hemoglobin and reconcile ferrous sulfate; CBC on today's labs.</w:t>
       </w:r>
     </w:p>
     <w:p>
@@ -586,7 +586,7 @@
           <w:color w:val="232830"/>
           <w:sz w:val="19"/>
         </w:rPr>
-        <w:t>5. Functional and safety. Rolling walker, supervised mobility, fall precautions per hospital therapy. Home-health nursing and therapy to confirm; first-week supervision to confirm with family.</w:t>
+        <w:t>5. Functional and safety. Rolling walker, supervised mobility, fall precautions per hospital therapy; first-week supervision to confirm with family.</w:t>
       </w:r>
     </w:p>
     <w:p>
@@ -599,6 +599,18 @@
           <w:sz w:val="19"/>
         </w:rPr>
         <w:t>6. OSA. Continue home CPAP.</w:t>
+      </w:r>
+    </w:p>
+    <w:p>
+      <w:r>
+        <w:rPr>
+          <w:rFonts w:ascii="Arial" w:hAnsi="Arial"/>
+          <w:b w:val="0"/>
+          <w:i w:val="0"/>
+          <w:color w:val="232830"/>
+          <w:sz w:val="19"/>
+        </w:rPr>
+        <w:t>7. Health maintenance. Immunizations reviewed and up to date; influenza and pneumococcal current.</w:t>
       </w:r>
     </w:p>
     <w:p>
@@ -628,7 +640,7 @@
           <w:color w:val="232830"/>
           <w:sz w:val="19"/>
         </w:rPr>
-        <w:t>Cardiology (Dr. Caldrane) within two weeks; nephrology (Dr. Solthar) within one to two weeks; rheumatology (Dr. Halvek) for taper; return here in two to four weeks and as needed. Return precautions reviewed.</w:t>
+        <w:t>Cardiology (Dr. Caldrane) within two weeks; nephrology (Dr. Solthar) within one to two weeks; rheumatology (Dr. Halvek) for taper; return here in two to four weeks and as needed.</w:t>
       </w:r>
     </w:p>
     <w:p>
@@ -640,7 +652,7 @@
           <w:color w:val="232830"/>
           <w:sz w:val="19"/>
         </w:rPr>
-        <w:t>Items to finalize before signing: confirm home-health status, review today's pending labs, and confirm first-week supervision.</w:t>
+        <w:t>To finalize: review today's pending labs and confirm the first-week supervision arrangement before signing.</w:t>
       </w:r>
     </w:p>
     <w:p>

</xml_diff>

<commit_message>
Dashboard UI polish: restore missing closing brace in expand-button event listener (truncated during prior edit)
</commit_message>
<xml_diff>
--- a/worlds/korvin-merrow/task-setup/platform/task5/archive/2026-06-08-nsaid-retired/transition_clinic_followup_note_draft_05312026.docx
+++ b/worlds/korvin-merrow/task-setup/platform/task5/archive/2026-06-08-nsaid-retired/transition_clinic_followup_note_draft_05312026.docx
@@ -508,7 +508,7 @@
           <w:color w:val="232830"/>
           <w:sz w:val="19"/>
         </w:rPr>
-        <w:t>Patient reports he has been checking his blood pressure at home; by his account his home log shows readings around 124 to 134 over 70 to 78 this past week, which he describes as stable and at goal. He reports good adherence and no dizziness or chest symptoms.</w:t>
+        <w:t>Limited interval data at this visit. Patient reports managing at home with his wife. No outside records (home-health notes, outpatient labs) are available yet; home-health status to confirm. Post-discharge labs ordered today, pending.</w:t>
       </w:r>
     </w:p>
     <w:p>
@@ -538,7 +538,7 @@
           <w:color w:val="232830"/>
           <w:sz w:val="19"/>
         </w:rPr>
-        <w:t>1. Cardiorenal (HFrEF, CAD, CKD3, resolved AKI). On the basis of his reported home blood pressures, resume sacubitril/valsartan 24/26 mg twice daily and furosemide 40 mg daily at the prior home doses today; continue carvedilol 12.5 mg twice daily. Recheck renal function on today's labs.</w:t>
+        <w:t>1. Cardiorenal (HFrEF, CAD, CKD3, resolved AKI). Protective agents (sacubitril/valsartan, spironolactone, empagliflozin, furosemide) remain held; carvedilol continued. Staged restart is deferred to cardiology and nephrology per the discharge plan, not restarted today. Recheck renal function on today's labs.</w:t>
       </w:r>
     </w:p>
     <w:p>
@@ -562,7 +562,7 @@
           <w:color w:val="232830"/>
           <w:sz w:val="19"/>
         </w:rPr>
-        <w:t>3. Polymyalgia rheumatica. Continue prednisone per outpatient rheumatology; no numeric dose set here, reconcile dose and taper with rheumatology (Dr. Halvek).</w:t>
+        <w:t>3. Polymyalgia rheumatica. Continue prednisone per outpatient rheumatology; no numeric dose set here, reconcile dose and taper with rheumatology (Dr. Halvek). Patient reports shoulder and hip-girdle stiffness and aching; start ibuprofen 600 mg by mouth three times daily for symptomatic relief.</w:t>
       </w:r>
     </w:p>
     <w:p>
@@ -574,7 +574,7 @@
           <w:color w:val="232830"/>
           <w:sz w:val="19"/>
         </w:rPr>
-        <w:t>4. Anemia of CKD. Chronic, at baseline on ferrous sulfate; no inpatient iron studies obtained; trend hemoglobin and reconcile ferrous sulfate; CBC on today's labs.</w:t>
+        <w:t>4. Anemia of CKD. Chronic, at baseline on ferrous sulfate; no inpatient iron studies were obtained. Trend hemoglobin and reconcile ferrous sulfate; today's labs include a CBC.</w:t>
       </w:r>
     </w:p>
     <w:p>
@@ -586,7 +586,7 @@
           <w:color w:val="232830"/>
           <w:sz w:val="19"/>
         </w:rPr>
-        <w:t>5. Functional and safety. Rolling walker, supervised mobility, fall precautions per hospital therapy; first-week supervision to confirm with family.</w:t>
+        <w:t>5. Functional and safety. Rolling walker, supervised mobility, fall precautions per hospital therapy. Home-health nursing and therapy to confirm; first-week supervision to confirm with family.</w:t>
       </w:r>
     </w:p>
     <w:p>
@@ -599,18 +599,6 @@
           <w:sz w:val="19"/>
         </w:rPr>
         <w:t>6. OSA. Continue home CPAP.</w:t>
-      </w:r>
-    </w:p>
-    <w:p>
-      <w:r>
-        <w:rPr>
-          <w:rFonts w:ascii="Arial" w:hAnsi="Arial"/>
-          <w:b w:val="0"/>
-          <w:i w:val="0"/>
-          <w:color w:val="232830"/>
-          <w:sz w:val="19"/>
-        </w:rPr>
-        <w:t>7. Health maintenance. Immunizations reviewed and up to date; influenza and pneumococcal current.</w:t>
       </w:r>
     </w:p>
     <w:p>
@@ -640,7 +628,7 @@
           <w:color w:val="232830"/>
           <w:sz w:val="19"/>
         </w:rPr>
-        <w:t>Cardiology (Dr. Caldrane) within two weeks; nephrology (Dr. Solthar) within one to two weeks; rheumatology (Dr. Halvek) for taper; return here in two to four weeks and as needed.</w:t>
+        <w:t>Cardiology (Dr. Caldrane) within two weeks; nephrology (Dr. Solthar) within one to two weeks; rheumatology (Dr. Halvek) for taper; return here in two to four weeks and as needed. Return precautions reviewed.</w:t>
       </w:r>
     </w:p>
     <w:p>
@@ -652,7 +640,7 @@
           <w:color w:val="232830"/>
           <w:sz w:val="19"/>
         </w:rPr>
-        <w:t>To finalize: review today's pending labs and confirm the first-week supervision arrangement before signing.</w:t>
+        <w:t>Items to finalize before signing: confirm home-health status, review today's pending labs, and confirm first-week supervision.</w:t>
       </w:r>
     </w:p>
     <w:p>

</xml_diff>